<commit_message>
Preenche RG e CPF do representante da Contratante
Qualificação da CONTRATANTE e bloco de assinatura passam a trazer o RG
46.270.985-1 e o CPF 386.386.288-03 do administrador que assina pela
Mediterrâneo. Nome completo, nacionalidade, estado civil e profissão
seguem pendentes.

Co-Authored-By: Claude Opus 5 <noreply@anthropic.com>
Claude-Session: https://claude.ai/code/session_01JvuJwy7yY4EnoYMkQynCaG
</commit_message>
<xml_diff>
--- a/docs/juridico/contrato-zeladoria-mediterraneo.docx
+++ b/docs/juridico/contrato-zeladoria-mediterraneo.docx
@@ -90,7 +90,31 @@
         <w:rPr>
           <w:b w:val="0"/>
         </w:rPr>
-        <w:t xml:space="preserve">, [nacionalidade], [estado civil], [profissão], portador do RG nº [___] e inscrito no CPF sob o nº [___], doravante denominada simplesmente </w:t>
+        <w:t xml:space="preserve">, [nacionalidade], [estado civil], [profissão], portador da Cédula de Identidade RG nº </w:t>
+      </w:r>
+      <w:r>
+        <w:rPr>
+          <w:b/>
+        </w:rPr>
+        <w:t>46.270.985-1</w:t>
+      </w:r>
+      <w:r>
+        <w:rPr>
+          <w:b w:val="0"/>
+        </w:rPr>
+        <w:t xml:space="preserve"> e inscrito no CPF sob o nº </w:t>
+      </w:r>
+      <w:r>
+        <w:rPr>
+          <w:b/>
+        </w:rPr>
+        <w:t>386.386.288-03</w:t>
+      </w:r>
+      <w:r>
+        <w:rPr>
+          <w:b w:val="0"/>
+        </w:rPr>
+        <w:t xml:space="preserve">, doravante denominada simplesmente </w:t>
       </w:r>
       <w:r>
         <w:rPr>
@@ -5411,7 +5435,7 @@
                 <w:b w:val="0"/>
                 <w:sz w:val="18"/>
               </w:rPr>
-              <w:t>CPF:</w:t>
+              <w:t>CPF: 386.386.288-03</w:t>
             </w:r>
           </w:p>
         </w:tc>

</xml_diff>